<commit_message>
Emploi du temps des personnages : curseurs métier / disciples / entraînement, renfort des apprentis, métier de Chercheur, rendement selon le goût de l'effort
Co-Authored-By: Claude Opus 5.5 <noreply@anthropic.com>
</commit_message>
<xml_diff>
--- a/Jeu Sanctuaire.docx
+++ b/Jeu Sanctuaire.docx
@@ -65,35 +65,14 @@
         <w:t>% sur un métier</w:t>
       </w:r>
       <w:r>
-        <w:t xml:space="preserve"> (pope, recruteur, recherches en </w:t>
-      </w:r>
-      <w:proofErr w:type="spellStart"/>
-      <w:r>
-        <w:t>bibilotheque</w:t>
-      </w:r>
-      <w:proofErr w:type="spellEnd"/>
-      <w:r>
-        <w:t xml:space="preserve">, gardien d’un site spécifique sur terre, intendant, maitre d’œuvre, </w:t>
-      </w:r>
-      <w:proofErr w:type="spellStart"/>
-      <w:r>
-        <w:t>ect</w:t>
-      </w:r>
-      <w:proofErr w:type="spellEnd"/>
-      <w:r>
-        <w:t xml:space="preserve">). </w:t>
+        <w:t xml:space="preserve"> (pope, recruteur, recherches en bibilotheque, gardien d’un site spécifique sur terre, intendant, maitre d’œuvre, ect). </w:t>
       </w:r>
       <w:r>
         <w:t>, % entrainement disciples, % entrainement perso</w:t>
       </w:r>
       <w:r>
-        <w:t xml:space="preserve">. Un perso blessé doit consacrer tout son tps à se soigner. Une ratio de tps bonus-malus est appliqué au tps que consacre le personnage selon ses stats : gout de l’effort, </w:t>
-      </w:r>
-      <w:proofErr w:type="spellStart"/>
-      <w:r>
-        <w:t>fainiantise</w:t>
-      </w:r>
-      <w:proofErr w:type="spellEnd"/>
+        <w:t>. Un perso blessé doit consacrer tout son tps à se soigner. Une ratio de tps bonus-malus est appliqué au tps que consacre le personnage selon ses stats : gout de l’effort, fainiantise</w:t>
+      </w:r>
     </w:p>
     <w:p>
       <w:pPr>
@@ -115,38 +94,17 @@
         <w:t>Apprentis :</w:t>
       </w:r>
       <w:r>
-        <w:t xml:space="preserve"> on </w:t>
-      </w:r>
-      <w:proofErr w:type="spellStart"/>
-      <w:r>
-        <w:t>reaprtis</w:t>
-      </w:r>
-      <w:proofErr w:type="spellEnd"/>
-      <w:r>
-        <w:t xml:space="preserve"> un tps d’apprentissage sur % entrainement, % aide au sanctuaire. </w:t>
-      </w:r>
-      <w:r>
-        <w:t xml:space="preserve">Un ratio de tps bonus-malus est appliqué au tps que consacre le personnage selon ses stats : gout de l’effort, </w:t>
-      </w:r>
-      <w:proofErr w:type="spellStart"/>
-      <w:r>
-        <w:t>fainiantise</w:t>
-      </w:r>
-      <w:proofErr w:type="spellEnd"/>
-      <w:r>
-        <w:br/>
-      </w:r>
-      <w:r>
-        <w:br/>
-        <w:t xml:space="preserve">Sur l’entrainement : on configure comment le perso va s’entrainer : on </w:t>
-      </w:r>
-      <w:proofErr w:type="spellStart"/>
-      <w:r>
-        <w:t>deplace</w:t>
-      </w:r>
-      <w:proofErr w:type="spellEnd"/>
-      <w:r>
-        <w:t xml:space="preserve"> des curseurs sur la répartition des entrainement : physique, rapidité, dextérité, méditation, psychokinésie, cosmos, endurance, études</w:t>
+        <w:t xml:space="preserve"> on reaprtis un tps d’apprentissage sur % entrainement, % aide au sanctuaire. </w:t>
+      </w:r>
+      <w:r>
+        <w:t>Un ratio de tps bonus-malus est appliqué au tps que consacre le personnage selon ses stats : gout de l’effort, fainiantise</w:t>
+      </w:r>
+      <w:r>
+        <w:br/>
+      </w:r>
+      <w:r>
+        <w:br/>
+        <w:t>Sur l’entrainement : on configure comment le perso va s’entrainer : on deplace des curseurs sur la répartition des entrainement : physique, rapidité, dextérité, méditation, psychokinésie, cosmos, endurance, études</w:t>
       </w:r>
     </w:p>
     <w:p>
@@ -158,164 +116,20 @@
           <w:b/>
           <w:bCs/>
         </w:rPr>
-        <w:t xml:space="preserve">On pourra également utiliser des points d’endurance restant du perso ou des potions d’endurance pour lui faire faire des entrainements spécifiques sur </w:t>
-      </w:r>
-      <w:proofErr w:type="spellStart"/>
-      <w:r>
-        <w:rPr>
-          <w:b/>
-          <w:bCs/>
-        </w:rPr>
-        <w:t>lesquel</w:t>
-      </w:r>
-      <w:proofErr w:type="spellEnd"/>
-      <w:r>
-        <w:rPr>
-          <w:b/>
-          <w:bCs/>
-        </w:rPr>
-        <w:t xml:space="preserve"> on cliquera.</w:t>
-      </w:r>
-      <w:r>
-        <w:t xml:space="preserve"> Les missions sur lesquelles il sera affecté, avec un chevalier notamment, lui permettra de </w:t>
-      </w:r>
-      <w:proofErr w:type="spellStart"/>
-      <w:r>
-        <w:t>recup</w:t>
-      </w:r>
-      <w:proofErr w:type="spellEnd"/>
-      <w:r>
-        <w:t xml:space="preserve"> de l’</w:t>
-      </w:r>
-      <w:proofErr w:type="spellStart"/>
-      <w:r>
-        <w:t>xp</w:t>
-      </w:r>
-      <w:proofErr w:type="spellEnd"/>
-      <w:r>
-        <w:t xml:space="preserve"> et de points qu’on repartira librement sur l’apprentis. Idem pour les chevaliers.</w:t>
-      </w:r>
-      <w:r>
-        <w:br/>
-      </w:r>
-      <w:r>
-        <w:br/>
-        <w:t xml:space="preserve">Des missions </w:t>
-      </w:r>
-      <w:proofErr w:type="spellStart"/>
-      <w:r>
-        <w:t>seronts</w:t>
-      </w:r>
-      <w:proofErr w:type="spellEnd"/>
-      <w:r>
-        <w:t xml:space="preserve"> proposées</w:t>
-      </w:r>
-      <w:r>
-        <w:t xml:space="preserve"> où sera indiqué le niveau de la mission, le type de compétences nécessaires, le nombre de personnes conseillées (pas obligatoire si un perso se sent assez compétent pour tout faire seul). On </w:t>
-      </w:r>
-      <w:proofErr w:type="spellStart"/>
-      <w:r>
-        <w:t>ppurra</w:t>
-      </w:r>
-      <w:proofErr w:type="spellEnd"/>
-      <w:r>
-        <w:t xml:space="preserve"> faire des missions en mode auto (comme </w:t>
-      </w:r>
-      <w:proofErr w:type="spellStart"/>
-      <w:r>
-        <w:t>ds</w:t>
-      </w:r>
-      <w:proofErr w:type="spellEnd"/>
-      <w:r>
-        <w:t xml:space="preserve"> les </w:t>
-      </w:r>
-      <w:proofErr w:type="spellStart"/>
-      <w:r>
-        <w:t>rdp</w:t>
-      </w:r>
-      <w:proofErr w:type="spellEnd"/>
-      <w:r>
-        <w:t xml:space="preserve"> </w:t>
-      </w:r>
-      <w:proofErr w:type="spellStart"/>
-      <w:r>
-        <w:t>idol</w:t>
-      </w:r>
-      <w:proofErr w:type="spellEnd"/>
-      <w:r>
-        <w:t xml:space="preserve"> </w:t>
-      </w:r>
-      <w:proofErr w:type="spellStart"/>
-      <w:r>
-        <w:t>game</w:t>
-      </w:r>
-      <w:proofErr w:type="spellEnd"/>
-      <w:r>
-        <w:t>/</w:t>
-      </w:r>
-      <w:proofErr w:type="spellStart"/>
-      <w:r>
-        <w:t>gacha</w:t>
-      </w:r>
-      <w:proofErr w:type="spellEnd"/>
-      <w:r>
-        <w:t xml:space="preserve"> ou on met des perso en mission auto et où il </w:t>
-      </w:r>
-      <w:proofErr w:type="spellStart"/>
-      <w:r>
-        <w:t>sne</w:t>
-      </w:r>
-      <w:proofErr w:type="spellEnd"/>
-      <w:r>
-        <w:t xml:space="preserve"> sont plus dispo pour un tps pour le sanctuaire, et également </w:t>
-      </w:r>
-      <w:proofErr w:type="spellStart"/>
-      <w:r>
-        <w:t>ds</w:t>
-      </w:r>
-      <w:proofErr w:type="spellEnd"/>
-      <w:r>
-        <w:t xml:space="preserve"> missions où on joue en direct avec eux. Les persos peuvent être blessés, accumulent de la fatigue et peuvent mourir en de tragiques occasion. L’armure </w:t>
-      </w:r>
-      <w:proofErr w:type="spellStart"/>
-      <w:r>
-        <w:t>ds</w:t>
-      </w:r>
-      <w:proofErr w:type="spellEnd"/>
-      <w:r>
-        <w:t xml:space="preserve"> ce cas reste là où le chevalier est mort et un chevalier devra la ramener et enterrer le chevalier décédé au </w:t>
-      </w:r>
-      <w:proofErr w:type="spellStart"/>
-      <w:r>
-        <w:t>cimetiére</w:t>
-      </w:r>
-      <w:proofErr w:type="spellEnd"/>
-      <w:r>
-        <w:t xml:space="preserve"> du </w:t>
-      </w:r>
-      <w:proofErr w:type="spellStart"/>
-      <w:r>
-        <w:t>santuaire</w:t>
-      </w:r>
-      <w:proofErr w:type="spellEnd"/>
-      <w:r>
-        <w:t xml:space="preserve">. L’armure du défunt devra être réparée par le forgeron du sanctuaire (nécessité de </w:t>
-      </w:r>
-      <w:proofErr w:type="spellStart"/>
-      <w:r>
-        <w:t>maétriaux</w:t>
-      </w:r>
-      <w:proofErr w:type="spellEnd"/>
-      <w:r>
-        <w:t xml:space="preserve"> spécifiques a </w:t>
-      </w:r>
-      <w:proofErr w:type="spellStart"/>
-      <w:r>
-        <w:t>farmer</w:t>
-      </w:r>
-      <w:proofErr w:type="spellEnd"/>
-      <w:r>
-        <w:t xml:space="preserve"> dont orichalque).</w:t>
+        <w:t>On pourra également utiliser des points d’endurance restant du perso ou des potions d’endurance pour lui faire faire des entrainements spécifiques sur lesquel on cliquera.</w:t>
+      </w:r>
+      <w:r>
+        <w:t xml:space="preserve"> Les missions sur lesquelles il sera affecté, avec un chevalier notamment, lui permettra de recup de l’xp et de points qu’on repartira librement sur l’apprentis. Idem pour les chevaliers.</w:t>
+      </w:r>
+      <w:r>
+        <w:br/>
+      </w:r>
+      <w:r>
+        <w:br/>
+        <w:t>Des missions seronts proposées</w:t>
+      </w:r>
+      <w:r>
+        <w:t xml:space="preserve"> où sera indiqué le niveau de la mission, le type de compétences nécessaires, le nombre de personnes conseillées (pas obligatoire si un perso se sent assez compétent pour tout faire seul). On ppurra faire des missions en mode auto (comme ds les rdp idol game/gacha ou on met des perso en mission auto et où il sne sont plus dispo pour un tps pour le sanctuaire, et également ds missions où on joue en direct avec eux. Les persos peuvent être blessés, accumulent de la fatigue et peuvent mourir en de tragiques occasion. L’armure ds ce cas reste là où le chevalier est mort et un chevalier devra la ramener et enterrer le chevalier décédé au cimetiére du santuaire. L’armure du défunt devra être réparée par le forgeron du sanctuaire (nécessité de maétriaux spécifiques a farmer dont orichalque).</w:t>
       </w:r>
     </w:p>
     <w:p>
@@ -347,107 +161,74 @@
       </w:r>
       <w:r>
         <w:lastRenderedPageBreak/>
-        <w:t xml:space="preserve">Eau -Air -Terre-Feu : le score de ressources est calculé en fonction : nombre de chevaliers et apprentis étant de chaque </w:t>
-      </w:r>
-      <w:proofErr w:type="spellStart"/>
-      <w:r>
-        <w:t>élement</w:t>
-      </w:r>
-      <w:proofErr w:type="spellEnd"/>
-      <w:r>
-        <w:t xml:space="preserve">. Un </w:t>
-      </w:r>
-      <w:proofErr w:type="spellStart"/>
-      <w:r>
-        <w:t>coeff</w:t>
-      </w:r>
-      <w:proofErr w:type="spellEnd"/>
-      <w:r>
-        <w:t xml:space="preserve"> multiplicateur est appliqué selon le rang : apprentis, garde, bronze, argent, or, pope. Un </w:t>
-      </w:r>
-      <w:proofErr w:type="spellStart"/>
-      <w:r>
-        <w:t>coeff</w:t>
-      </w:r>
-      <w:proofErr w:type="spellEnd"/>
-      <w:r>
-        <w:t xml:space="preserve"> est également appliqué en fonction de la valeur en cosmos de chacun. Cela donne un pool d’</w:t>
-      </w:r>
-      <w:proofErr w:type="spellStart"/>
-      <w:r>
-        <w:t>élements</w:t>
-      </w:r>
-      <w:proofErr w:type="spellEnd"/>
-      <w:r>
-        <w:t xml:space="preserve"> en début de partie. Chaque fois que le sanctuaire progresse par l’amélioration de ses perso ce pool progresse. Cela permet d’</w:t>
-      </w:r>
-      <w:proofErr w:type="spellStart"/>
-      <w:r>
-        <w:t>acceder</w:t>
-      </w:r>
-      <w:proofErr w:type="spellEnd"/>
-      <w:r>
-        <w:t xml:space="preserve"> a des parties d’un niveau plus élevé et qui permettent de gagner des bonus permanents plus intéressants.</w:t>
-      </w:r>
-      <w:r>
-        <w:br/>
-      </w:r>
-      <w:r>
-        <w:br/>
-        <w:t xml:space="preserve">On commence la partie également avec un deck de jusqu’à 3 cartes d’artefact que l’on a </w:t>
-      </w:r>
-      <w:proofErr w:type="spellStart"/>
-      <w:r>
-        <w:t>selectionnées</w:t>
-      </w:r>
-      <w:proofErr w:type="spellEnd"/>
-      <w:r>
-        <w:t xml:space="preserve">. Ces cartes, si on les </w:t>
-      </w:r>
-      <w:proofErr w:type="spellStart"/>
-      <w:r>
-        <w:t>posséde</w:t>
-      </w:r>
-      <w:proofErr w:type="spellEnd"/>
-      <w:r>
-        <w:t xml:space="preserve"> (on en gagnera au cours du jeu), donnent des avantages permanent sur la partie (bouclier d’</w:t>
-      </w:r>
-      <w:proofErr w:type="spellStart"/>
-      <w:r>
-        <w:t>athena</w:t>
-      </w:r>
-      <w:proofErr w:type="spellEnd"/>
-      <w:r>
-        <w:t xml:space="preserve">, masque du grand pope, </w:t>
-      </w:r>
-      <w:proofErr w:type="spellStart"/>
-      <w:r>
-        <w:t>etc</w:t>
-      </w:r>
-      <w:proofErr w:type="spellEnd"/>
-      <w:r>
-        <w:t xml:space="preserve">). </w:t>
-      </w:r>
-      <w:r>
-        <w:br/>
-      </w:r>
-      <w:r>
-        <w:br/>
-      </w:r>
-      <w:r>
-        <w:br/>
-      </w:r>
-      <w:r>
-        <w:br/>
-      </w:r>
-      <w:r>
-        <w:br/>
-      </w:r>
-      <w:r>
-        <w:br/>
-      </w:r>
-      <w:r>
-        <w:br/>
+        <w:t>Eau -Air -Terre-Feu : le score de ressources est calculé en fonction : nombre de chevaliers et apprentis étant de chaque élement. Un coeff multiplicateur est appliqué selon le rang : apprentis, garde, bronze, argent, or, pope. Un coeff est également appliqué en fonction de la valeur en cosmos de chacun. Cela donne un pool d’élements en début de partie. Chaque fois que le sanctuaire progresse par l’amélioration de ses perso ce pool progresse. Cela permet d’acceder a des parties d’un niveau plus élevé et qui permettent de gagner des bonus permanents plus intéressants.</w:t>
+      </w:r>
+      <w:r>
+        <w:br/>
+      </w:r>
+      <w:r>
+        <w:br/>
+        <w:t xml:space="preserve">On commence la partie également avec un deck de jusqu’à 3 cartes d’artefact que l’on a selectionnées. Ces cartes, si on les posséde (on en gagnera au cours du jeu), donnent des avantages permanent sur la partie (bouclier d’athena, masque du grand pope, etc). </w:t>
+      </w:r>
+      <w:r>
+        <w:br/>
+      </w:r>
+      <w:r>
+        <w:br/>
+      </w:r>
+      <w:r>
+        <w:br/>
+      </w:r>
+      <w:r>
+        <w:br/>
+      </w:r>
+      <w:r>
+        <w:br/>
+      </w:r>
+      <w:r>
+        <w:br/>
+      </w:r>
+      <w:r>
+        <w:br/>
+      </w:r>
+      <w:r>
+        <w:t>sur le jeux lecture des astres du grand pope que l’on ne puisse acheter que 2 cartes maxi par tour</w:t>
+      </w:r>
+      <w:r>
+        <w:br/>
+      </w:r>
+      <w:r>
+        <w:br/>
+        <w:t>le menu sanctuaire n’est plus accessible à réparer</w:t>
+      </w:r>
+      <w:r>
+        <w:br/>
+      </w:r>
+      <w:r>
+        <w:br/>
+        <w:t>**********************</w:t>
+      </w:r>
+      <w:r>
+        <w:br/>
+      </w:r>
+      <w:r>
+        <w:br/>
+        <w:t>sur la page du menu grand pope afficher afficher une sous page avec les bonus apportés par chaque chevalier et le total pour le jeu « lecture des astres »</w:t>
+      </w:r>
+      <w:r>
+        <w:br/>
+      </w:r>
+      <w:r>
+        <w:br/>
+      </w:r>
+      <w:r>
+        <w:t>clé api mammouth</w:t>
+      </w:r>
+      <w:r>
+        <w:br/>
+      </w:r>
+      <w:r>
+        <w:t>sk-dBjrOHGNNWDm5CeGTWWqZg</w:t>
       </w:r>
     </w:p>
     <w:sectPr>

</xml_diff>